<commit_message>
review do gráfico e da série de ingressos por cotas
</commit_message>
<xml_diff>
--- a/docs/index.docx
+++ b/docs/index.docx
@@ -23,7 +23,7 @@
         <w:pStyle w:val="Data"/>
       </w:pPr>
       <w:r>
-        <w:t xml:space="preserve">22 abril, 2026</w:t>
+        <w:t xml:space="preserve">24 abril, 2026</w:t>
       </w:r>
     </w:p>
     <w:sdt>
@@ -1381,7 +1381,7 @@
         <w:pStyle w:val="Corpodetexto"/>
       </w:pPr>
       <w:r>
-        <w:t xml:space="preserve">Ao analisar a representatividade de indígenas em cada órgão, a tabela a seguir aponta Ministerio Dos Povos Indigenas (MPI), com 33.03% e Fundacao Nacional Dos Povos Indigenas (FUNAI), com 23.35% como aqueles em que há maior presença de indígenas com relação ao total de vínculos. Juntos, estes órgãos contam com 2.156 vínculos, sendo que 23,8% são de pessoas indígenas. Por outro lado, estes mesmo órgãos concentram 22,9% dos vínculos ativos de indígenas.</w:t>
+        <w:t xml:space="preserve">Ao analisar a representatividade de indígenas em cada órgão, a tabela a seguir aponta Ministério Dos Povos Indígenas (MPI), com 33.03% e Fundação Nacional Dos Povos Indígenas (FUNAI), com 23.35% como aqueles em que há maior presença de indígenas com relação ao total de vínculos. Juntos, estes órgãos contam com 2.156 vínculos, sendo que 23,8% são de pessoas indígenas. Por outro lado, estes mesmo órgãos concentram 22,9% dos vínculos ativos de indígenas.</w:t>
       </w:r>
     </w:p>
     <w:p xmlns:w="http://schemas.openxmlformats.org/wordprocessingml/2006/main" xmlns:wp="http://schemas.openxmlformats.org/drawingml/2006/wordprocessingDrawing" xmlns:r="http://schemas.openxmlformats.org/officeDocument/2006/relationships" xmlns:w14="http://schemas.microsoft.com/office/word/2010/wordml">
@@ -1507,7 +1507,7 @@
                 <w:szCs w:val="22"/>
                 <w:color w:val="FFFFFF"/>
               </w:rPr>
-              <w:t xml:space="preserve">Órgão vinculado</w:t>
+              <w:t xml:space="preserve">Sigla do Órgão</w:t>
             </w:r>
           </w:p>
         </w:tc>
@@ -1561,7 +1561,7 @@
                 <w:szCs w:val="22"/>
                 <w:color w:val="FFFFFF"/>
               </w:rPr>
-              <w:t xml:space="preserve">Sigla do Órgão</w:t>
+              <w:t xml:space="preserve">Órgão</w:t>
             </w:r>
           </w:p>
         </w:tc>
@@ -1837,7 +1837,7 @@
                 <w:szCs w:val="22"/>
                 <w:color w:val="000000"/>
               </w:rPr>
-              <w:t xml:space="preserve">MINISTERIO DOS POVOS INDIGENAS</w:t>
+              <w:t xml:space="preserve">Ministério dos Povos Indígenas</w:t>
             </w:r>
           </w:p>
         </w:tc>
@@ -2113,7 +2113,7 @@
                 <w:szCs w:val="22"/>
                 <w:color w:val="000000"/>
               </w:rPr>
-              <w:t xml:space="preserve">FUNDACAO NACIONAL DOS POVOS INDIGENAS</w:t>
+              <w:t xml:space="preserve">Fundação Nacional dos Povos Indígenas</w:t>
             </w:r>
           </w:p>
         </w:tc>
@@ -2389,7 +2389,7 @@
                 <w:szCs w:val="22"/>
                 <w:color w:val="000000"/>
               </w:rPr>
-              <w:t xml:space="preserve">INST. BR. MEIO AMB. REC. NAT. RENOVAVEIS</w:t>
+              <w:t xml:space="preserve">Instituto Brasileiro do Meio Ambiente e dos Recursos Naturais Renováveis</w:t>
             </w:r>
           </w:p>
         </w:tc>
@@ -2665,7 +2665,7 @@
                 <w:szCs w:val="22"/>
                 <w:color w:val="000000"/>
               </w:rPr>
-              <w:t xml:space="preserve">INSTITUTO FEDERAL DO AMAZONAS</w:t>
+              <w:t xml:space="preserve">Instituto Federal do Amazonas</w:t>
             </w:r>
           </w:p>
         </w:tc>
@@ -2941,7 +2941,7 @@
                 <w:szCs w:val="22"/>
                 <w:color w:val="000000"/>
               </w:rPr>
-              <w:t xml:space="preserve">GOVERNO DO EX-TERRITORIO DE RORAIMA</w:t>
+              <w:t xml:space="preserve">Governo do Ex-Território de Roraima</w:t>
             </w:r>
           </w:p>
         </w:tc>
@@ -3217,7 +3217,7 @@
                 <w:szCs w:val="22"/>
                 <w:color w:val="000000"/>
               </w:rPr>
-              <w:t xml:space="preserve">UNIVERSIDADE FEDERAL DE RORAIMA</w:t>
+              <w:t xml:space="preserve">Universidade Federal de Roraima</w:t>
             </w:r>
           </w:p>
         </w:tc>
@@ -3644,7 +3644,7 @@
         <w:pStyle w:val="Corpodetexto"/>
       </w:pPr>
       <w:r>
-        <w:t xml:space="preserve">Ao analisar a distribuição de indígenas por órgão, a tabela a seguir aponta Fundacao Nacional Dos Povos Indigenas (FUNAI), Ministerio Da Saude (MS), Inst. Br. Meio Amb. Rec. Nat. Renovaveis (IBAMA) e Governo Do Ex-Territorio De Roraima (EX-TER/RR) como aqueles em que os vínculos de indígenas estão mais concentrados, responsáveis por 49,5% dos vínculos ativos de indígenas.</w:t>
+        <w:t xml:space="preserve">Ao analisar a distribuição de indígenas por órgão, a tabela a seguir aponta Fundação Nacional Dos Povos Indígenas (FUNAI), Ministério Da Saúde (MS), Instituto Brasileiro Do Meio Ambiente E Dos Recursos Naturais Renováveis (IBAMA) e Governo Do Ex-Território De Roraima (EX-TER/RR) como aqueles em que os vínculos de indígenas estão mais concentrados, responsáveis por 49,5% dos vínculos ativos de indígenas.</w:t>
       </w:r>
     </w:p>
     <w:p xmlns:w="http://schemas.openxmlformats.org/wordprocessingml/2006/main" xmlns:wp="http://schemas.openxmlformats.org/drawingml/2006/wordprocessingDrawing" xmlns:r="http://schemas.openxmlformats.org/officeDocument/2006/relationships" xmlns:w14="http://schemas.microsoft.com/office/word/2010/wordml">
@@ -3770,7 +3770,7 @@
                 <w:szCs w:val="22"/>
                 <w:color w:val="FFFFFF"/>
               </w:rPr>
-              <w:t xml:space="preserve">Sigla do Órgão</w:t>
+              <w:t xml:space="preserve">Sigla</w:t>
             </w:r>
           </w:p>
         </w:tc>
@@ -3824,7 +3824,7 @@
                 <w:szCs w:val="22"/>
                 <w:color w:val="FFFFFF"/>
               </w:rPr>
-              <w:t xml:space="preserve">Órgão vinculado</w:t>
+              <w:t xml:space="preserve">Órgão</w:t>
             </w:r>
           </w:p>
         </w:tc>
@@ -4100,7 +4100,7 @@
                 <w:szCs w:val="22"/>
                 <w:color w:val="000000"/>
               </w:rPr>
-              <w:t xml:space="preserve">FUNDACAO NACIONAL DOS POVOS INDIGENAS</w:t>
+              <w:t xml:space="preserve">Fundação Nacional dos Povos Indígenas</w:t>
             </w:r>
           </w:p>
         </w:tc>
@@ -4376,7 +4376,7 @@
                 <w:szCs w:val="22"/>
                 <w:color w:val="000000"/>
               </w:rPr>
-              <w:t xml:space="preserve">MINISTERIO DA SAUDE</w:t>
+              <w:t xml:space="preserve">Ministério da Saúde</w:t>
             </w:r>
           </w:p>
         </w:tc>
@@ -4652,7 +4652,7 @@
                 <w:szCs w:val="22"/>
                 <w:color w:val="000000"/>
               </w:rPr>
-              <w:t xml:space="preserve">INST. BR. MEIO AMB. REC. NAT. RENOVAVEIS</w:t>
+              <w:t xml:space="preserve">Instituto Brasileiro do Meio Ambiente e dos Recursos Naturais Renováveis</w:t>
             </w:r>
           </w:p>
         </w:tc>
@@ -4928,7 +4928,7 @@
                 <w:szCs w:val="22"/>
                 <w:color w:val="000000"/>
               </w:rPr>
-              <w:t xml:space="preserve">GOVERNO DO EX-TERRITORIO DE RORAIMA</w:t>
+              <w:t xml:space="preserve">Governo do Ex-Território de Roraima</w:t>
             </w:r>
           </w:p>
         </w:tc>
@@ -5204,7 +5204,7 @@
                 <w:szCs w:val="22"/>
                 <w:color w:val="000000"/>
               </w:rPr>
-              <w:t xml:space="preserve">INSTITUTO CHICO MENDES CONSERV.BIODIVER.</w:t>
+              <w:t xml:space="preserve">Instituto Chico Mendes de Conservação da Biodiversidade</w:t>
             </w:r>
           </w:p>
         </w:tc>
@@ -5480,7 +5480,7 @@
                 <w:szCs w:val="22"/>
                 <w:color w:val="000000"/>
               </w:rPr>
-              <w:t xml:space="preserve">INSTITUTO FEDERAL DO AMAZONAS</w:t>
+              <w:t xml:space="preserve">Instituto Federal do Amazonas</w:t>
             </w:r>
           </w:p>
         </w:tc>
@@ -5982,7 +5982,7 @@
         <w:pStyle w:val="Corpodetexto"/>
       </w:pPr>
       <w:r>
-        <w:t xml:space="preserve">Desde então, foram registrados 211 ingressos por cota para indígenas, o que corresponde a 39,9% dos ingressos de indígenas (529) no governo federal.</w:t>
+        <w:t xml:space="preserve">Desde então, foram registrados 224 ingressos por cota para indígenas, o que corresponde a 68,9% dos ingressos de indígenas (325) no governo federal.</w:t>
       </w:r>
     </w:p>
     <w:p>

</xml_diff>

<commit_message>
vários updates em diversos formatos
</commit_message>
<xml_diff>
--- a/docs/index.docx
+++ b/docs/index.docx
@@ -23,7 +23,7 @@
         <w:pStyle w:val="Data"/>
       </w:pPr>
       <w:r>
-        <w:t>24 abril, 2026</w:t>
+        <w:t>27 abril, 2026</w:t>
       </w:r>
     </w:p>
     <w:sdt>
@@ -34,7 +34,7 @@
           <w:sz w:val="24"/>
           <w:szCs w:val="24"/>
         </w:rPr>
-        <w:id w:val="1239903898"/>
+        <w:id w:val="1060749604"/>
         <w:docPartObj>
           <w:docPartGallery w:val="Table of Contents"/>
           <w:docPartUnique/>
@@ -46,7 +46,7 @@
             <w:pStyle w:val="CabealhodoSumrio"/>
           </w:pPr>
           <w:r>
-            <w:t>Table of Contents</w:t>
+            <w:t>Sumário</w:t>
           </w:r>
         </w:p>
         <w:p>
@@ -59,7 +59,7 @@
               <w:rFonts w:asciiTheme="minorHAnsi" w:eastAsiaTheme="minorEastAsia" w:hAnsiTheme="minorHAnsi"/>
               <w:noProof/>
               <w:kern w:val="2"/>
-              <w:lang w:val="pt-BR" w:eastAsia="pt-BR"/>
+              <w:lang w:eastAsia="pt-BR"/>
               <w14:ligatures w14:val="standardContextual"/>
             </w:rPr>
           </w:pPr>
@@ -72,7 +72,7 @@
           <w:r>
             <w:fldChar w:fldCharType="separate"/>
           </w:r>
-          <w:hyperlink w:anchor="_Toc227951623" w:history="1">
+          <w:hyperlink w:anchor="_Toc228189219" w:history="1">
             <w:r>
               <w:rPr>
                 <w:rStyle w:val="Hyperlink"/>
@@ -99,7 +99,7 @@
                 <w:noProof/>
                 <w:webHidden/>
               </w:rPr>
-              <w:instrText xml:space="preserve"> PAGEREF _Toc227951623 \h </w:instrText>
+              <w:instrText xml:space="preserve"> PAGEREF _Toc228189219 \h </w:instrText>
             </w:r>
             <w:r>
               <w:rPr>
@@ -140,11 +140,11 @@
               <w:rFonts w:asciiTheme="minorHAnsi" w:eastAsiaTheme="minorEastAsia" w:hAnsiTheme="minorHAnsi"/>
               <w:noProof/>
               <w:kern w:val="2"/>
-              <w:lang w:val="pt-BR" w:eastAsia="pt-BR"/>
+              <w:lang w:eastAsia="pt-BR"/>
               <w14:ligatures w14:val="standardContextual"/>
             </w:rPr>
           </w:pPr>
-          <w:hyperlink w:anchor="_Toc227951624" w:history="1">
+          <w:hyperlink w:anchor="_Toc228189220" w:history="1">
             <w:r>
               <w:rPr>
                 <w:rStyle w:val="Hyperlink"/>
@@ -171,7 +171,7 @@
                 <w:noProof/>
                 <w:webHidden/>
               </w:rPr>
-              <w:instrText xml:space="preserve"> PAGEREF _Toc227951624 \h </w:instrText>
+              <w:instrText xml:space="preserve"> PAGEREF _Toc228189220 \h </w:instrText>
             </w:r>
             <w:r>
               <w:rPr>
@@ -212,11 +212,11 @@
               <w:rFonts w:asciiTheme="minorHAnsi" w:eastAsiaTheme="minorEastAsia" w:hAnsiTheme="minorHAnsi"/>
               <w:noProof/>
               <w:kern w:val="2"/>
-              <w:lang w:val="pt-BR" w:eastAsia="pt-BR"/>
+              <w:lang w:eastAsia="pt-BR"/>
               <w14:ligatures w14:val="standardContextual"/>
             </w:rPr>
           </w:pPr>
-          <w:hyperlink w:anchor="_Toc227951625" w:history="1">
+          <w:hyperlink w:anchor="_Toc228189221" w:history="1">
             <w:r>
               <w:rPr>
                 <w:rStyle w:val="Hyperlink"/>
@@ -243,7 +243,7 @@
                 <w:noProof/>
                 <w:webHidden/>
               </w:rPr>
-              <w:instrText xml:space="preserve"> PAGEREF _Toc227951625 \h </w:instrText>
+              <w:instrText xml:space="preserve"> PAGEREF _Toc228189221 \h </w:instrText>
             </w:r>
             <w:r>
               <w:rPr>
@@ -284,11 +284,11 @@
               <w:rFonts w:asciiTheme="minorHAnsi" w:eastAsiaTheme="minorEastAsia" w:hAnsiTheme="minorHAnsi"/>
               <w:noProof/>
               <w:kern w:val="2"/>
-              <w:lang w:val="pt-BR" w:eastAsia="pt-BR"/>
+              <w:lang w:eastAsia="pt-BR"/>
               <w14:ligatures w14:val="standardContextual"/>
             </w:rPr>
           </w:pPr>
-          <w:hyperlink w:anchor="_Toc227951626" w:history="1">
+          <w:hyperlink w:anchor="_Toc228189222" w:history="1">
             <w:r>
               <w:rPr>
                 <w:rStyle w:val="Hyperlink"/>
@@ -315,7 +315,7 @@
                 <w:noProof/>
                 <w:webHidden/>
               </w:rPr>
-              <w:instrText xml:space="preserve"> PAGEREF _Toc227951626 \h </w:instrText>
+              <w:instrText xml:space="preserve"> PAGEREF _Toc228189222 \h </w:instrText>
             </w:r>
             <w:r>
               <w:rPr>
@@ -356,11 +356,11 @@
               <w:rFonts w:asciiTheme="minorHAnsi" w:eastAsiaTheme="minorEastAsia" w:hAnsiTheme="minorHAnsi"/>
               <w:noProof/>
               <w:kern w:val="2"/>
-              <w:lang w:val="pt-BR" w:eastAsia="pt-BR"/>
+              <w:lang w:eastAsia="pt-BR"/>
               <w14:ligatures w14:val="standardContextual"/>
             </w:rPr>
           </w:pPr>
-          <w:hyperlink w:anchor="_Toc227951627" w:history="1">
+          <w:hyperlink w:anchor="_Toc228189223" w:history="1">
             <w:r>
               <w:rPr>
                 <w:rStyle w:val="Hyperlink"/>
@@ -387,7 +387,7 @@
                 <w:noProof/>
                 <w:webHidden/>
               </w:rPr>
-              <w:instrText xml:space="preserve"> PAGEREF _Toc227951627 \h </w:instrText>
+              <w:instrText xml:space="preserve"> PAGEREF _Toc228189223 \h </w:instrText>
             </w:r>
             <w:r>
               <w:rPr>
@@ -428,11 +428,11 @@
               <w:rFonts w:asciiTheme="minorHAnsi" w:eastAsiaTheme="minorEastAsia" w:hAnsiTheme="minorHAnsi"/>
               <w:noProof/>
               <w:kern w:val="2"/>
-              <w:lang w:val="pt-BR" w:eastAsia="pt-BR"/>
+              <w:lang w:eastAsia="pt-BR"/>
               <w14:ligatures w14:val="standardContextual"/>
             </w:rPr>
           </w:pPr>
-          <w:hyperlink w:anchor="_Toc227951628" w:history="1">
+          <w:hyperlink w:anchor="_Toc228189224" w:history="1">
             <w:r>
               <w:rPr>
                 <w:rStyle w:val="Hyperlink"/>
@@ -459,7 +459,7 @@
                 <w:noProof/>
                 <w:webHidden/>
               </w:rPr>
-              <w:instrText xml:space="preserve"> PAGEREF _Toc227951628 \h </w:instrText>
+              <w:instrText xml:space="preserve"> PAGEREF _Toc228189224 \h </w:instrText>
             </w:r>
             <w:r>
               <w:rPr>
@@ -500,11 +500,11 @@
               <w:rFonts w:asciiTheme="minorHAnsi" w:eastAsiaTheme="minorEastAsia" w:hAnsiTheme="minorHAnsi"/>
               <w:noProof/>
               <w:kern w:val="2"/>
-              <w:lang w:val="pt-BR" w:eastAsia="pt-BR"/>
+              <w:lang w:eastAsia="pt-BR"/>
               <w14:ligatures w14:val="standardContextual"/>
             </w:rPr>
           </w:pPr>
-          <w:hyperlink w:anchor="_Toc227951629" w:history="1">
+          <w:hyperlink w:anchor="_Toc228189225" w:history="1">
             <w:r>
               <w:rPr>
                 <w:rStyle w:val="Hyperlink"/>
@@ -531,7 +531,7 @@
                 <w:noProof/>
                 <w:webHidden/>
               </w:rPr>
-              <w:instrText xml:space="preserve"> PAGEREF _Toc227951629 \h </w:instrText>
+              <w:instrText xml:space="preserve"> PAGEREF _Toc228189225 \h </w:instrText>
             </w:r>
             <w:r>
               <w:rPr>
@@ -572,11 +572,11 @@
               <w:rFonts w:asciiTheme="minorHAnsi" w:eastAsiaTheme="minorEastAsia" w:hAnsiTheme="minorHAnsi"/>
               <w:noProof/>
               <w:kern w:val="2"/>
-              <w:lang w:val="pt-BR" w:eastAsia="pt-BR"/>
+              <w:lang w:eastAsia="pt-BR"/>
               <w14:ligatures w14:val="standardContextual"/>
             </w:rPr>
           </w:pPr>
-          <w:hyperlink w:anchor="_Toc227951630" w:history="1">
+          <w:hyperlink w:anchor="_Toc228189226" w:history="1">
             <w:r>
               <w:rPr>
                 <w:rStyle w:val="Hyperlink"/>
@@ -603,7 +603,7 @@
                 <w:noProof/>
                 <w:webHidden/>
               </w:rPr>
-              <w:instrText xml:space="preserve"> PAGEREF _Toc227951630 \h </w:instrText>
+              <w:instrText xml:space="preserve"> PAGEREF _Toc228189226 \h </w:instrText>
             </w:r>
             <w:r>
               <w:rPr>
@@ -644,11 +644,11 @@
               <w:rFonts w:asciiTheme="minorHAnsi" w:eastAsiaTheme="minorEastAsia" w:hAnsiTheme="minorHAnsi"/>
               <w:noProof/>
               <w:kern w:val="2"/>
-              <w:lang w:val="pt-BR" w:eastAsia="pt-BR"/>
+              <w:lang w:eastAsia="pt-BR"/>
               <w14:ligatures w14:val="standardContextual"/>
             </w:rPr>
           </w:pPr>
-          <w:hyperlink w:anchor="_Toc227951631" w:history="1">
+          <w:hyperlink w:anchor="_Toc228189227" w:history="1">
             <w:r>
               <w:rPr>
                 <w:rStyle w:val="Hyperlink"/>
@@ -675,7 +675,7 @@
                 <w:noProof/>
                 <w:webHidden/>
               </w:rPr>
-              <w:instrText xml:space="preserve"> PAGEREF _Toc227951631 \h </w:instrText>
+              <w:instrText xml:space="preserve"> PAGEREF _Toc228189227 \h </w:instrText>
             </w:r>
             <w:r>
               <w:rPr>
@@ -716,11 +716,11 @@
               <w:rFonts w:asciiTheme="minorHAnsi" w:eastAsiaTheme="minorEastAsia" w:hAnsiTheme="minorHAnsi"/>
               <w:noProof/>
               <w:kern w:val="2"/>
-              <w:lang w:val="pt-BR" w:eastAsia="pt-BR"/>
+              <w:lang w:eastAsia="pt-BR"/>
               <w14:ligatures w14:val="standardContextual"/>
             </w:rPr>
           </w:pPr>
-          <w:hyperlink w:anchor="_Toc227951632" w:history="1">
+          <w:hyperlink w:anchor="_Toc228189228" w:history="1">
             <w:r>
               <w:rPr>
                 <w:rStyle w:val="Hyperlink"/>
@@ -747,7 +747,7 @@
                 <w:noProof/>
                 <w:webHidden/>
               </w:rPr>
-              <w:instrText xml:space="preserve"> PAGEREF _Toc227951632 \h </w:instrText>
+              <w:instrText xml:space="preserve"> PAGEREF _Toc228189228 \h </w:instrText>
             </w:r>
             <w:r>
               <w:rPr>
@@ -790,7 +790,7 @@
         <w:pStyle w:val="Ttulo1"/>
       </w:pPr>
       <w:bookmarkStart w:id="0" w:name="análise-da-representatividade"/>
-      <w:bookmarkStart w:id="1" w:name="_Toc227951623"/>
+      <w:bookmarkStart w:id="1" w:name="_Toc228189219"/>
       <w:r>
         <w:t>Análise da Representatividade</w:t>
       </w:r>
@@ -1859,7 +1859,7 @@
           <w:noProof/>
         </w:rPr>
         <w:drawing>
-          <wp:inline distT="0" distB="0" distL="0" distR="0" wp14:anchorId="637B4069" wp14:editId="637B406A">
+          <wp:inline distT="0" distB="0" distL="0" distR="0" wp14:anchorId="7158E5D4" wp14:editId="7158E5D5">
             <wp:extent cx="5600700" cy="3733800"/>
             <wp:effectExtent l="0" t="0" r="0" b="0"/>
             <wp:docPr id="21" name="Picture"/>
@@ -1919,7 +1919,7 @@
         </w:rPr>
         <w:lastRenderedPageBreak/>
         <w:drawing>
-          <wp:inline distT="0" distB="0" distL="0" distR="0" wp14:anchorId="637B406B" wp14:editId="637B406C">
+          <wp:inline distT="0" distB="0" distL="0" distR="0" wp14:anchorId="7158E5D6" wp14:editId="7158E5D7">
             <wp:extent cx="5600700" cy="3733800"/>
             <wp:effectExtent l="0" t="0" r="0" b="0"/>
             <wp:docPr id="24" name="Picture"/>
@@ -1966,7 +1966,7 @@
         <w:pStyle w:val="Corpodetexto"/>
       </w:pPr>
       <w:r>
-        <w:t>Ao analisar a representatividade de indígenas em cada órgão, a tabela a seguir aponta Ministério Dos Povos Indígenas (MPI), com 33.03% e Fundação Nacional Dos Povos Indígenas (FUNAI), com 23.35% como aqueles em que há maior presença de indígenas com relação ao total de vínculos. Juntos, estes órgãos contam com 2.156 vínculos, sendo que 23,8% são de pessoas indígenas. Por outro lado, estes mesmo órgãos concentram 22,9% dos vínculos ativos de indígenas.</w:t>
+        <w:t>Ao analisar a representatividade de indígenas em cada órgão, a tabela a seguir aponta Ministério Dos Povos Indígenas (MPI), com 33.03% e Fundação Nacional Dos Povos Indígenas (FUNAI), com 23.35%, como aqueles em que há maior presença de indígenas com relação ao total de vínculos. Juntos, estes órgãos contam com 2.156 vínculos, sendo que 23,8% são de pessoas indígenas. Por outro lado, estes mesmo órgãos concentram 22,9% dos vínculos ativos de indígenas.</w:t>
       </w:r>
     </w:p>
     <w:p>
@@ -3694,7 +3694,7 @@
         <w:pStyle w:val="Ttulo1"/>
       </w:pPr>
       <w:bookmarkStart w:id="2" w:name="perfil-dos-vínculos-ativos-de-indígenas"/>
-      <w:bookmarkStart w:id="3" w:name="_Toc227951624"/>
+      <w:bookmarkStart w:id="3" w:name="_Toc228189220"/>
       <w:bookmarkEnd w:id="0"/>
       <w:r>
         <w:t>Perfil dos vínculos ativos de indígenas</w:t>
@@ -3706,7 +3706,7 @@
         <w:pStyle w:val="Ttulo2"/>
       </w:pPr>
       <w:bookmarkStart w:id="4" w:name="sexo-e-faixa-etária"/>
-      <w:bookmarkStart w:id="5" w:name="_Toc227951625"/>
+      <w:bookmarkStart w:id="5" w:name="_Toc228189221"/>
       <w:r>
         <w:t>Sexo e faixa etária</w:t>
       </w:r>
@@ -3738,7 +3738,7 @@
         </w:rPr>
         <w:lastRenderedPageBreak/>
         <w:drawing>
-          <wp:inline distT="0" distB="0" distL="0" distR="0" wp14:anchorId="637B406D" wp14:editId="637B406E">
+          <wp:inline distT="0" distB="0" distL="0" distR="0" wp14:anchorId="7158E5D8" wp14:editId="7158E5D9">
             <wp:extent cx="5600700" cy="3733800"/>
             <wp:effectExtent l="0" t="0" r="0" b="0"/>
             <wp:docPr id="28" name="Picture"/>
@@ -3784,7 +3784,7 @@
           <w:noProof/>
         </w:rPr>
         <w:drawing>
-          <wp:inline distT="0" distB="0" distL="0" distR="0" wp14:anchorId="637B406F" wp14:editId="637B4070">
+          <wp:inline distT="0" distB="0" distL="0" distR="0" wp14:anchorId="7158E5DA" wp14:editId="7158E5DB">
             <wp:extent cx="5600700" cy="3733800"/>
             <wp:effectExtent l="0" t="0" r="0" b="0"/>
             <wp:docPr id="31" name="Picture"/>
@@ -3831,7 +3831,7 @@
         <w:pStyle w:val="Ttulo2"/>
       </w:pPr>
       <w:bookmarkStart w:id="6" w:name="escolaridade"/>
-      <w:bookmarkStart w:id="7" w:name="_Toc227951626"/>
+      <w:bookmarkStart w:id="7" w:name="_Toc228189222"/>
       <w:bookmarkEnd w:id="4"/>
       <w:r>
         <w:lastRenderedPageBreak/>
@@ -3856,7 +3856,7 @@
           <w:noProof/>
         </w:rPr>
         <w:drawing>
-          <wp:inline distT="0" distB="0" distL="0" distR="0" wp14:anchorId="637B4071" wp14:editId="637B4072">
+          <wp:inline distT="0" distB="0" distL="0" distR="0" wp14:anchorId="7158E5DC" wp14:editId="7158E5DD">
             <wp:extent cx="5600700" cy="3733800"/>
             <wp:effectExtent l="0" t="0" r="0" b="0"/>
             <wp:docPr id="35" name="Picture"/>
@@ -3903,7 +3903,7 @@
         <w:pStyle w:val="Ttulo2"/>
       </w:pPr>
       <w:bookmarkStart w:id="8" w:name="órgão-de-vínculo"/>
-      <w:bookmarkStart w:id="9" w:name="_Toc227951627"/>
+      <w:bookmarkStart w:id="9" w:name="_Toc228189223"/>
       <w:bookmarkEnd w:id="6"/>
       <w:r>
         <w:t>Órgão de Vínculo</w:t>
@@ -3928,7 +3928,7 @@
         </w:rPr>
         <w:lastRenderedPageBreak/>
         <w:drawing>
-          <wp:inline distT="0" distB="0" distL="0" distR="0" wp14:anchorId="637B4073" wp14:editId="637B4074">
+          <wp:inline distT="0" distB="0" distL="0" distR="0" wp14:anchorId="7158E5DE" wp14:editId="7158E5DF">
             <wp:extent cx="5600700" cy="3733800"/>
             <wp:effectExtent l="0" t="0" r="0" b="0"/>
             <wp:docPr id="39" name="Picture"/>
@@ -5713,7 +5713,7 @@
         <w:pStyle w:val="Corpodetexto"/>
       </w:pPr>
       <w:r>
-        <w:t>Com relação à UF de exercício do servidor, a maior concentração de vínculos indígena está no DF, RR e AM, que somam 966, 43,0% do total deste grupo.</w:t>
+        <w:t>Com relação à UF de exercício do servidor, a maior concentração de vínculos indígenas está no DF, RR e AM, que somam vínculos ativos, 966, 43,0% do total deste grupo.</w:t>
       </w:r>
     </w:p>
     <w:p>
@@ -5725,7 +5725,7 @@
           <w:noProof/>
         </w:rPr>
         <w:drawing>
-          <wp:inline distT="0" distB="0" distL="0" distR="0" wp14:anchorId="637B4075" wp14:editId="637B4076">
+          <wp:inline distT="0" distB="0" distL="0" distR="0" wp14:anchorId="7158E5E0" wp14:editId="7158E5E1">
             <wp:extent cx="5600700" cy="3733800"/>
             <wp:effectExtent l="0" t="0" r="0" b="0"/>
             <wp:docPr id="42" name="Picture"/>
@@ -5772,7 +5772,7 @@
         <w:pStyle w:val="Ttulo1"/>
       </w:pPr>
       <w:bookmarkStart w:id="10" w:name="X8163ef843acfafcf822527c481284c30324a875"/>
-      <w:bookmarkStart w:id="11" w:name="_Toc227951628"/>
+      <w:bookmarkStart w:id="11" w:name="_Toc228189224"/>
       <w:bookmarkEnd w:id="2"/>
       <w:bookmarkEnd w:id="8"/>
       <w:r>
@@ -5786,7 +5786,7 @@
         <w:pStyle w:val="Ttulo2"/>
       </w:pPr>
       <w:bookmarkStart w:id="12" w:name="servidores-efetivos"/>
-      <w:bookmarkStart w:id="13" w:name="_Toc227951629"/>
+      <w:bookmarkStart w:id="13" w:name="_Toc228189225"/>
       <w:r>
         <w:t>Servidores efetivos</w:t>
       </w:r>
@@ -5797,7 +5797,7 @@
         <w:pStyle w:val="FirstParagraph"/>
       </w:pPr>
       <w:r>
-        <w:t>Em Fevereiro/2026, 73% dos vínculos ativos de indígenas eram de servidores com cargo efetivo. Considerando todos os vínculos ativos da APF, este percentual era de 94%. Entre os indígenas, o percentuaL de servidores com cargo efetivo era de 75.3%.</w:t>
+        <w:t>Em Fevereiro/2026, 75% dos vínculos ativos de indígenas eram de servidores com cargo efetivo. Considerando todos os vínculos ativos da APF, este percentual era de 96%.</w:t>
       </w:r>
     </w:p>
     <w:p>
@@ -5809,7 +5809,7 @@
           <w:noProof/>
         </w:rPr>
         <w:drawing>
-          <wp:inline distT="0" distB="0" distL="0" distR="0" wp14:anchorId="637B4077" wp14:editId="637B4078">
+          <wp:inline distT="0" distB="0" distL="0" distR="0" wp14:anchorId="7158E5E2" wp14:editId="7158E5E3">
             <wp:extent cx="5600700" cy="3733800"/>
             <wp:effectExtent l="0" t="0" r="0" b="0"/>
             <wp:docPr id="47" name="Picture"/>
@@ -5864,7 +5864,7 @@
         <w:pStyle w:val="Corpodetexto"/>
       </w:pPr>
       <w:r>
-        <w:t>Em relação aos vínculos sem cargo efetivo, também registrou queda a partir de 2016, com um salto no ano 2021 de 416 para 800.</w:t>
+        <w:t>Em relação aos vínculos sem cargo efetivo, também registrou-se queda a partir de 2016, com um salto no ano 2021 de 416 para 800.</w:t>
       </w:r>
     </w:p>
     <w:p>
@@ -5877,7 +5877,7 @@
         </w:rPr>
         <w:lastRenderedPageBreak/>
         <w:drawing>
-          <wp:inline distT="0" distB="0" distL="0" distR="0" wp14:anchorId="637B4079" wp14:editId="637B407A">
+          <wp:inline distT="0" distB="0" distL="0" distR="0" wp14:anchorId="7158E5E4" wp14:editId="7158E5E5">
             <wp:extent cx="5600700" cy="3733800"/>
             <wp:effectExtent l="0" t="0" r="0" b="0"/>
             <wp:docPr id="50" name="Picture"/>
@@ -5945,7 +5945,7 @@
         </w:rPr>
         <w:lastRenderedPageBreak/>
         <w:drawing>
-          <wp:inline distT="0" distB="0" distL="0" distR="0" wp14:anchorId="637B407B" wp14:editId="637B407C">
+          <wp:inline distT="0" distB="0" distL="0" distR="0" wp14:anchorId="7158E5E6" wp14:editId="7158E5E7">
             <wp:extent cx="5600700" cy="3733800"/>
             <wp:effectExtent l="0" t="0" r="0" b="0"/>
             <wp:docPr id="53" name="Picture"/>
@@ -5992,7 +5992,7 @@
         <w:pStyle w:val="Ttulo2"/>
       </w:pPr>
       <w:bookmarkStart w:id="14" w:name="saídas-e-ingressos-com-cotas-x-sem-cotas"/>
-      <w:bookmarkStart w:id="15" w:name="_Toc227951630"/>
+      <w:bookmarkStart w:id="15" w:name="_Toc228189226"/>
       <w:bookmarkEnd w:id="12"/>
       <w:r>
         <w:t>Saídas e ingressos (com cotas x sem cotas)</w:t>
@@ -6004,7 +6004,7 @@
         <w:pStyle w:val="FirstParagraph"/>
       </w:pPr>
       <w:r>
-        <w:t>O gráfico a seguir aponta as variações anuais de saídas e ingressos de servidores efetivos indígenas. A variação no número de efetivos foi negativa durante todo o período em que o número de aposentadorias e óbito foi superior ao número de ingressos, de 2017 a 2022. Tal situação explica a queda a queda no número de servidores efetivos no período.</w:t>
+        <w:t>O gráfico a seguir aponta as variações anuais de saídas e ingressos de servidores efetivos indígenas. A variação no número de efetivos foi negativa durante todo o período em que o número de aposentadorias e óbitos foi superior ao número de ingressos, de 2017 a 2022. Tal situação explica a queda a queda no número de servidores efetivos ativos no período.</w:t>
       </w:r>
     </w:p>
     <w:p>
@@ -6017,7 +6017,7 @@
         </w:rPr>
         <w:lastRenderedPageBreak/>
         <w:drawing>
-          <wp:inline distT="0" distB="0" distL="0" distR="0" wp14:anchorId="637B407D" wp14:editId="637B407E">
+          <wp:inline distT="0" distB="0" distL="0" distR="0" wp14:anchorId="7158E5E8" wp14:editId="7158E5E9">
             <wp:extent cx="5600700" cy="3733800"/>
             <wp:effectExtent l="0" t="0" r="0" b="0"/>
             <wp:docPr id="57" name="Picture"/>
@@ -6085,7 +6085,7 @@
         </w:rPr>
         <w:lastRenderedPageBreak/>
         <w:drawing>
-          <wp:inline distT="0" distB="0" distL="0" distR="0" wp14:anchorId="637B407F" wp14:editId="637B4080">
+          <wp:inline distT="0" distB="0" distL="0" distR="0" wp14:anchorId="7158E5EA" wp14:editId="7158E5EB">
             <wp:extent cx="5600700" cy="3733800"/>
             <wp:effectExtent l="0" t="0" r="0" b="0"/>
             <wp:docPr id="60" name="Picture"/>
@@ -6132,7 +6132,7 @@
         <w:pStyle w:val="Ttulo1"/>
       </w:pPr>
       <w:bookmarkStart w:id="16" w:name="Xfcac080e7188923a63322b9cc871d6b5b18965d"/>
-      <w:bookmarkStart w:id="17" w:name="_Toc227951631"/>
+      <w:bookmarkStart w:id="17" w:name="_Toc228189227"/>
       <w:bookmarkEnd w:id="10"/>
       <w:bookmarkEnd w:id="14"/>
       <w:r>
@@ -6166,7 +6166,7 @@
         </w:rPr>
         <w:lastRenderedPageBreak/>
         <w:drawing>
-          <wp:inline distT="0" distB="0" distL="0" distR="0" wp14:anchorId="637B4081" wp14:editId="637B4082">
+          <wp:inline distT="0" distB="0" distL="0" distR="0" wp14:anchorId="7158E5EC" wp14:editId="7158E5ED">
             <wp:extent cx="5600700" cy="3733800"/>
             <wp:effectExtent l="0" t="0" r="0" b="0"/>
             <wp:docPr id="65" name="Picture"/>
@@ -6226,7 +6226,7 @@
         </w:rPr>
         <w:lastRenderedPageBreak/>
         <w:drawing>
-          <wp:inline distT="0" distB="0" distL="0" distR="0" wp14:anchorId="637B4083" wp14:editId="637B4084">
+          <wp:inline distT="0" distB="0" distL="0" distR="0" wp14:anchorId="7158E5EE" wp14:editId="7158E5EF">
             <wp:extent cx="5600700" cy="3733800"/>
             <wp:effectExtent l="0" t="0" r="0" b="0"/>
             <wp:docPr id="68" name="Picture"/>
@@ -6273,7 +6273,7 @@
         <w:pStyle w:val="Ttulo2"/>
       </w:pPr>
       <w:bookmarkStart w:id="18" w:name="índice-de-equidade-para-função-fce"/>
-      <w:bookmarkStart w:id="19" w:name="_Toc227951632"/>
+      <w:bookmarkStart w:id="19" w:name="_Toc228189228"/>
       <w:r>
         <w:t>Índice de equidade para função FCE</w:t>
       </w:r>
@@ -6332,17 +6332,35 @@
             <m:num>
               <m:r>
                 <m:rPr>
+                  <m:sty m:val="p"/>
+                </m:rPr>
+                <w:rPr>
+                  <w:rFonts w:ascii="Cambria Math" w:hAnsi="Cambria Math"/>
+                </w:rPr>
+                <m:t>%</m:t>
+              </m:r>
+              <m:r>
+                <m:rPr>
                   <m:nor/>
                 </m:rPr>
-                <m:t>% indígenas em cargos FCE</m:t>
+                <m:t xml:space="preserve"> indígenas em cargos FCE</m:t>
               </m:r>
             </m:num>
             <m:den>
               <m:r>
                 <m:rPr>
+                  <m:sty m:val="p"/>
+                </m:rPr>
+                <w:rPr>
+                  <w:rFonts w:ascii="Cambria Math" w:hAnsi="Cambria Math"/>
+                </w:rPr>
+                <m:t>%</m:t>
+              </m:r>
+              <m:r>
+                <m:rPr>
                   <m:nor/>
                 </m:rPr>
-                <m:t>% indígenas no quadro efetivo ativo</m:t>
+                <m:t xml:space="preserve"> indígenas no quadro efetivo ativo</m:t>
               </m:r>
             </m:den>
           </m:f>
@@ -6467,7 +6485,7 @@
           <w:noProof/>
         </w:rPr>
         <w:drawing>
-          <wp:inline distT="0" distB="0" distL="0" distR="0" wp14:anchorId="637B4085" wp14:editId="637B4086">
+          <wp:inline distT="0" distB="0" distL="0" distR="0" wp14:anchorId="7158E5F0" wp14:editId="7158E5F1">
             <wp:extent cx="5600700" cy="3733800"/>
             <wp:effectExtent l="0" t="0" r="0" b="0"/>
             <wp:docPr id="71" name="Picture"/>
@@ -6814,7 +6832,7 @@
   <w:abstractNum w:abstractNumId="11" w15:restartNumberingAfterBreak="0">
     <w:nsid w:val="0000A990"/>
     <w:multiLevelType w:val="multilevel"/>
-    <w:tmpl w:val="2432FFA8"/>
+    <w:tmpl w:val="3E4C5C22"/>
     <w:lvl w:ilvl="0">
       <w:numFmt w:val="bullet"/>
       <w:lvlText w:val=" "/>
@@ -6891,7 +6909,7 @@
   <w:abstractNum w:abstractNumId="12" w15:restartNumberingAfterBreak="0">
     <w:nsid w:val="0000A991"/>
     <w:multiLevelType w:val="multilevel"/>
-    <w:tmpl w:val="144E4396"/>
+    <w:tmpl w:val="C240A396"/>
     <w:lvl w:ilvl="0">
       <w:numFmt w:val="bullet"/>
       <w:lvlText w:val=""/>
@@ -7209,16 +7227,16 @@
       </w:pPr>
     </w:lvl>
   </w:abstractNum>
-  <w:num w:numId="1" w16cid:durableId="599416336">
+  <w:num w:numId="1" w16cid:durableId="1470395563">
     <w:abstractNumId w:val="13"/>
   </w:num>
-  <w:num w:numId="2" w16cid:durableId="2071149634">
+  <w:num w:numId="2" w16cid:durableId="2013097284">
     <w:abstractNumId w:val="0"/>
   </w:num>
-  <w:num w:numId="3" w16cid:durableId="1491478053">
+  <w:num w:numId="3" w16cid:durableId="557012247">
     <w:abstractNumId w:val="0"/>
   </w:num>
-  <w:num w:numId="4" w16cid:durableId="1228614736">
+  <w:num w:numId="4" w16cid:durableId="1866020158">
     <w:abstractNumId w:val="14"/>
     <w:lvlOverride w:ilvl="0">
       <w:startOverride w:val="1"/>
@@ -7248,7 +7266,7 @@
       <w:startOverride w:val="1"/>
     </w:lvlOverride>
   </w:num>
-  <w:num w:numId="5" w16cid:durableId="1609317650">
+  <w:num w:numId="5" w16cid:durableId="89663737">
     <w:abstractNumId w:val="14"/>
     <w:lvlOverride w:ilvl="0">
       <w:startOverride w:val="1"/>
@@ -7278,40 +7296,40 @@
       <w:startOverride w:val="1"/>
     </w:lvlOverride>
   </w:num>
-  <w:num w:numId="6" w16cid:durableId="1642271074">
+  <w:num w:numId="6" w16cid:durableId="1553615481">
     <w:abstractNumId w:val="10"/>
   </w:num>
-  <w:num w:numId="7" w16cid:durableId="215094446">
+  <w:num w:numId="7" w16cid:durableId="1866627631">
     <w:abstractNumId w:val="8"/>
   </w:num>
-  <w:num w:numId="8" w16cid:durableId="288556239">
+  <w:num w:numId="8" w16cid:durableId="851920604">
     <w:abstractNumId w:val="7"/>
   </w:num>
-  <w:num w:numId="9" w16cid:durableId="1802335948">
+  <w:num w:numId="9" w16cid:durableId="1836912748">
     <w:abstractNumId w:val="6"/>
   </w:num>
-  <w:num w:numId="10" w16cid:durableId="1218586606">
+  <w:num w:numId="10" w16cid:durableId="654257352">
     <w:abstractNumId w:val="5"/>
   </w:num>
-  <w:num w:numId="11" w16cid:durableId="1507596996">
+  <w:num w:numId="11" w16cid:durableId="1560628424">
     <w:abstractNumId w:val="9"/>
   </w:num>
-  <w:num w:numId="12" w16cid:durableId="80612518">
+  <w:num w:numId="12" w16cid:durableId="792527091">
     <w:abstractNumId w:val="4"/>
   </w:num>
-  <w:num w:numId="13" w16cid:durableId="1897617908">
+  <w:num w:numId="13" w16cid:durableId="1686007950">
     <w:abstractNumId w:val="3"/>
   </w:num>
-  <w:num w:numId="14" w16cid:durableId="1476795815">
+  <w:num w:numId="14" w16cid:durableId="1749111360">
     <w:abstractNumId w:val="2"/>
   </w:num>
-  <w:num w:numId="15" w16cid:durableId="730032328">
+  <w:num w:numId="15" w16cid:durableId="1940941623">
     <w:abstractNumId w:val="1"/>
   </w:num>
-  <w:num w:numId="16" w16cid:durableId="1421412040">
+  <w:num w:numId="16" w16cid:durableId="1723669190">
     <w:abstractNumId w:val="11"/>
   </w:num>
-  <w:num w:numId="17" w16cid:durableId="1684091033">
+  <w:num w:numId="17" w16cid:durableId="1651866512">
     <w:abstractNumId w:val="12"/>
   </w:num>
 </w:numbering>
@@ -7325,7 +7343,7 @@
         <w:rFonts w:asciiTheme="minorHAnsi" w:eastAsiaTheme="minorHAnsi" w:hAnsiTheme="minorHAnsi" w:cstheme="minorBidi"/>
         <w:sz w:val="24"/>
         <w:szCs w:val="24"/>
-        <w:lang w:val="en-US" w:eastAsia="en-US" w:bidi="ar-SA"/>
+        <w:lang w:val="pt-BR" w:eastAsia="en-US" w:bidi="ar-SA"/>
       </w:rPr>
     </w:rPrDefault>
     <w:pPrDefault>
@@ -7341,7 +7359,7 @@
     <w:lsdException w:name="index 9" w:semiHidden="1" w:unhideWhenUsed="1"/>
     <w:lsdException w:name="toc 1" w:semiHidden="1" w:uiPriority="39" w:unhideWhenUsed="1"/>
     <w:lsdException w:name="toc 2" w:semiHidden="1" w:uiPriority="39" w:unhideWhenUsed="1"/>
-    <w:lsdException w:name="toc 3" w:semiHidden="1" w:unhideWhenUsed="1"/>
+    <w:lsdException w:name="toc 3" w:semiHidden="1" w:uiPriority="39" w:unhideWhenUsed="1"/>
     <w:lsdException w:name="toc 4" w:semiHidden="1" w:unhideWhenUsed="1"/>
     <w:lsdException w:name="toc 5" w:semiHidden="1" w:unhideWhenUsed="1"/>
     <w:lsdException w:name="toc 6" w:semiHidden="1" w:unhideWhenUsed="1"/>
@@ -8460,7 +8478,7 @@
     <w:autoRedefine/>
     <w:uiPriority w:val="39"/>
     <w:unhideWhenUsed/>
-    <w:rsid w:val="001E4531"/>
+    <w:rsid w:val="008B5817"/>
     <w:pPr>
       <w:spacing w:after="100"/>
     </w:pPr>
@@ -8472,10 +8490,23 @@
     <w:autoRedefine/>
     <w:uiPriority w:val="39"/>
     <w:unhideWhenUsed/>
-    <w:rsid w:val="001E4531"/>
+    <w:rsid w:val="008B5817"/>
     <w:pPr>
       <w:spacing w:after="100"/>
       <w:ind w:left="240"/>
+    </w:pPr>
+  </w:style>
+  <w:style w:type="paragraph" w:styleId="Sumrio3">
+    <w:name w:val="toc 3"/>
+    <w:basedOn w:val="Normal"/>
+    <w:next w:val="Normal"/>
+    <w:autoRedefine/>
+    <w:uiPriority w:val="39"/>
+    <w:unhideWhenUsed/>
+    <w:rsid w:val="008B5817"/>
+    <w:pPr>
+      <w:spacing w:after="100"/>
+      <w:ind w:left="480"/>
     </w:pPr>
   </w:style>
 </w:styles>

</xml_diff>

<commit_message>
nem sei que diff tem aqui, mas subindo
</commit_message>
<xml_diff>
--- a/docs/index.docx
+++ b/docs/index.docx
@@ -789,12 +789,12 @@
       <w:pPr>
         <w:pStyle w:val="Ttulo1"/>
       </w:pPr>
-      <w:bookmarkStart w:id="0" w:name="análise-da-representatividade"/>
-      <w:bookmarkStart w:id="1" w:name="_Toc228189219"/>
+      <w:bookmarkStart w:id="0" w:name="_Toc228189219"/>
+      <w:bookmarkStart w:id="1" w:name="análise-da-representatividade"/>
       <w:r>
         <w:t>Análise da Representatividade</w:t>
       </w:r>
-      <w:bookmarkEnd w:id="1"/>
+      <w:bookmarkEnd w:id="0"/>
     </w:p>
     <w:p>
       <w:pPr>
@@ -3693,24 +3693,24 @@
       <w:pPr>
         <w:pStyle w:val="Ttulo1"/>
       </w:pPr>
-      <w:bookmarkStart w:id="2" w:name="perfil-dos-vínculos-ativos-de-indígenas"/>
-      <w:bookmarkStart w:id="3" w:name="_Toc228189220"/>
-      <w:bookmarkEnd w:id="0"/>
+      <w:bookmarkStart w:id="2" w:name="_Toc228189220"/>
+      <w:bookmarkStart w:id="3" w:name="perfil-dos-vínculos-ativos-de-indígenas"/>
+      <w:bookmarkEnd w:id="1"/>
       <w:r>
         <w:t>Perfil dos vínculos ativos de indígenas</w:t>
       </w:r>
-      <w:bookmarkEnd w:id="3"/>
+      <w:bookmarkEnd w:id="2"/>
     </w:p>
     <w:p>
       <w:pPr>
         <w:pStyle w:val="Ttulo2"/>
       </w:pPr>
-      <w:bookmarkStart w:id="4" w:name="sexo-e-faixa-etária"/>
-      <w:bookmarkStart w:id="5" w:name="_Toc228189221"/>
+      <w:bookmarkStart w:id="4" w:name="_Toc228189221"/>
+      <w:bookmarkStart w:id="5" w:name="sexo-e-faixa-etária"/>
       <w:r>
         <w:t>Sexo e faixa etária</w:t>
       </w:r>
-      <w:bookmarkEnd w:id="5"/>
+      <w:bookmarkEnd w:id="4"/>
     </w:p>
     <w:p>
       <w:pPr>
@@ -3830,14 +3830,14 @@
       <w:pPr>
         <w:pStyle w:val="Ttulo2"/>
       </w:pPr>
-      <w:bookmarkStart w:id="6" w:name="escolaridade"/>
-      <w:bookmarkStart w:id="7" w:name="_Toc228189222"/>
-      <w:bookmarkEnd w:id="4"/>
+      <w:bookmarkStart w:id="6" w:name="_Toc228189222"/>
+      <w:bookmarkStart w:id="7" w:name="escolaridade"/>
+      <w:bookmarkEnd w:id="5"/>
       <w:r>
         <w:lastRenderedPageBreak/>
         <w:t>Escolaridade</w:t>
       </w:r>
-      <w:bookmarkEnd w:id="7"/>
+      <w:bookmarkEnd w:id="6"/>
     </w:p>
     <w:p>
       <w:pPr>
@@ -3902,13 +3902,13 @@
       <w:pPr>
         <w:pStyle w:val="Ttulo2"/>
       </w:pPr>
-      <w:bookmarkStart w:id="8" w:name="órgão-de-vínculo"/>
-      <w:bookmarkStart w:id="9" w:name="_Toc228189223"/>
-      <w:bookmarkEnd w:id="6"/>
+      <w:bookmarkStart w:id="8" w:name="_Toc228189223"/>
+      <w:bookmarkStart w:id="9" w:name="órgão-de-vínculo"/>
+      <w:bookmarkEnd w:id="7"/>
       <w:r>
         <w:t>Órgão de Vínculo</w:t>
       </w:r>
-      <w:bookmarkEnd w:id="9"/>
+      <w:bookmarkEnd w:id="8"/>
     </w:p>
     <w:p>
       <w:pPr>
@@ -5771,26 +5771,26 @@
       <w:pPr>
         <w:pStyle w:val="Ttulo1"/>
       </w:pPr>
-      <w:bookmarkStart w:id="10" w:name="X8163ef843acfafcf822527c481284c30324a875"/>
-      <w:bookmarkStart w:id="11" w:name="_Toc228189224"/>
-      <w:bookmarkEnd w:id="2"/>
-      <w:bookmarkEnd w:id="8"/>
+      <w:bookmarkStart w:id="10" w:name="_Toc228189224"/>
+      <w:bookmarkStart w:id="11" w:name="X8163ef843acfafcf822527c481284c30324a875"/>
+      <w:bookmarkEnd w:id="3"/>
+      <w:bookmarkEnd w:id="9"/>
       <w:r>
         <w:lastRenderedPageBreak/>
         <w:t>Saídas e ingressos de servidores efetivos</w:t>
       </w:r>
-      <w:bookmarkEnd w:id="11"/>
+      <w:bookmarkEnd w:id="10"/>
     </w:p>
     <w:p>
       <w:pPr>
         <w:pStyle w:val="Ttulo2"/>
       </w:pPr>
-      <w:bookmarkStart w:id="12" w:name="servidores-efetivos"/>
-      <w:bookmarkStart w:id="13" w:name="_Toc228189225"/>
+      <w:bookmarkStart w:id="12" w:name="_Toc228189225"/>
+      <w:bookmarkStart w:id="13" w:name="servidores-efetivos"/>
       <w:r>
         <w:t>Servidores efetivos</w:t>
       </w:r>
-      <w:bookmarkEnd w:id="13"/>
+      <w:bookmarkEnd w:id="12"/>
     </w:p>
     <w:p>
       <w:pPr>
@@ -5991,13 +5991,13 @@
       <w:pPr>
         <w:pStyle w:val="Ttulo2"/>
       </w:pPr>
-      <w:bookmarkStart w:id="14" w:name="saídas-e-ingressos-com-cotas-x-sem-cotas"/>
-      <w:bookmarkStart w:id="15" w:name="_Toc228189226"/>
-      <w:bookmarkEnd w:id="12"/>
+      <w:bookmarkStart w:id="14" w:name="_Toc228189226"/>
+      <w:bookmarkStart w:id="15" w:name="saídas-e-ingressos-com-cotas-x-sem-cotas"/>
+      <w:bookmarkEnd w:id="13"/>
       <w:r>
         <w:t>Saídas e ingressos (com cotas x sem cotas)</w:t>
       </w:r>
-      <w:bookmarkEnd w:id="15"/>
+      <w:bookmarkEnd w:id="14"/>
     </w:p>
     <w:p>
       <w:pPr>
@@ -6131,14 +6131,14 @@
       <w:pPr>
         <w:pStyle w:val="Ttulo1"/>
       </w:pPr>
-      <w:bookmarkStart w:id="16" w:name="Xfcac080e7188923a63322b9cc871d6b5b18965d"/>
-      <w:bookmarkStart w:id="17" w:name="_Toc228189227"/>
-      <w:bookmarkEnd w:id="10"/>
-      <w:bookmarkEnd w:id="14"/>
+      <w:bookmarkStart w:id="16" w:name="_Toc228189227"/>
+      <w:bookmarkStart w:id="17" w:name="Xfcac080e7188923a63322b9cc871d6b5b18965d"/>
+      <w:bookmarkEnd w:id="11"/>
+      <w:bookmarkEnd w:id="15"/>
       <w:r>
         <w:t>Cargos Comissionados e Funções de Confiança</w:t>
       </w:r>
-      <w:bookmarkEnd w:id="17"/>
+      <w:bookmarkEnd w:id="16"/>
     </w:p>
     <w:p>
       <w:pPr>
@@ -6272,12 +6272,12 @@
       <w:pPr>
         <w:pStyle w:val="Ttulo2"/>
       </w:pPr>
-      <w:bookmarkStart w:id="18" w:name="índice-de-equidade-para-função-fce"/>
-      <w:bookmarkStart w:id="19" w:name="_Toc228189228"/>
+      <w:bookmarkStart w:id="18" w:name="_Toc228189228"/>
+      <w:bookmarkStart w:id="19" w:name="índice-de-equidade-para-função-fce"/>
       <w:r>
         <w:t>Índice de equidade para função FCE</w:t>
       </w:r>
-      <w:bookmarkEnd w:id="19"/>
+      <w:bookmarkEnd w:id="18"/>
     </w:p>
     <w:p>
       <w:pPr>
@@ -6526,8 +6526,8 @@
           </wp:inline>
         </w:drawing>
       </w:r>
-      <w:bookmarkEnd w:id="16"/>
-      <w:bookmarkEnd w:id="18"/>
+      <w:bookmarkEnd w:id="17"/>
+      <w:bookmarkEnd w:id="19"/>
     </w:p>
     <w:sectPr>
       <w:pgSz w:w="12240" w:h="15840"/>

</xml_diff>